<commit_message>
BPM submission: 4 main figs + 2 SDC, bracketed refs, vector/TIFF export, tone pass
- Consolidate to 4 main figures + 2 tables (six display items); move signal
  decomposition and CCC range-dependence to Supplemental Digital Content.
- Add separately-numbered submission figures (Figure1-4, SDC1-2) as TIFF and
  vector PDF; select Arial/Helvetica when available.
- Single-source dynamic-system parameters via summary.json (no hard-coded
  labels); add dyn_systems to results parameters.
- Cover letter: article type, item counts, AI/synthetic-data disclosures.
- Tone pass on the English manuscript (reduce em-dash/AI-style phrasing).
- Update README/Makefile for new outputs and clean rules.

Co-Authored-By: Tatsuki Onishi <bougtoir@gmail.com>
</commit_message>
<xml_diff>
--- a/zero_calibration_bpm/cover_letter/BPM_Cover_Letter_EN.docx
+++ b/zero_calibration_bpm/cover_letter/BPM_Cover_Letter_EN.docx
@@ -87,7 +87,7 @@
           <w:b w:val="0"/>
           <w:sz w:val="24"/>
         </w:rPr>
-        <w:t>We further integrate the dynamic-response (damping) error that is specific to fluid-filled arterial lines—showing how under- and over-damping distort pulse pressure in ways that survive zeroing and are diagnosed by the fast-flush test—and we discuss the range-dependence of the concordance correlation coefficient. We believe this scope is well matched to the readership of Blood Pressure Monitoring, which spans the measurement, methodology and clinical interpretation of arterial pressure.</w:t>
+        <w:t>We further integrate the dynamic-response (damping) error that is specific to fluid-filled arterial lines, showing how under- and over-damping distort pulse pressure in ways that survive zeroing and are diagnosed by the fast-flush test, and we discuss the range-dependence of the concordance correlation coefficient. This scope matches the readership of Blood Pressure Monitoring, which spans the measurement, methodology and clinical interpretation of arterial pressure.</w:t>
       </w:r>
     </w:p>
     <w:p>
@@ -97,7 +97,17 @@
           <w:b w:val="0"/>
           <w:sz w:val="24"/>
         </w:rPr>
-        <w:t>This is a simulation study; all data are clearly described as synthetic and no clinical or previously published measurements are presented as empirical results. To support transparency and reuse, the complete pipeline—data generation, analysis, figures, tables and the manuscript itself—is openly available, so that every number, table and figure can be regenerated from a clean clone.</w:t>
+        <w:t>We submit the manuscript as an Original Study. It contains four figures and two tables (six items in total, within the journal limit), with two further figures provided as Supplemental Digital Content, a structured abstract of fewer than 250 words, and a main text within the 6000-word limit. As disclosed in the Methods, the simulation and analysis code, the figures, and drafts of the text were prepared with the assistance of an AI coding assistant (Devin; Cognition AI); the authors verified all code, results and statements and take full responsibility for the work.</w:t>
+      </w:r>
+    </w:p>
+    <w:p>
+      <w:r>
+        <w:rPr>
+          <w:rFonts w:ascii="Times New Roman" w:hAnsi="Times New Roman"/>
+          <w:b w:val="0"/>
+          <w:sz w:val="24"/>
+        </w:rPr>
+        <w:t>This is a simulation study; all data are clearly described as synthetic and no clinical or previously published measurements are presented as empirical results. To support transparency and reuse, the complete pipeline (data generation, analysis, figures, tables and the manuscript itself) is openly available, so that every number, table and figure can be regenerated from a clean clone.</w:t>
       </w:r>
     </w:p>
     <w:p>

</xml_diff>